<commit_message>
cleaning up the repository structure
</commit_message>
<xml_diff>
--- a/Rival Blog Platform.docx
+++ b/Rival Blog Platform.docx
@@ -608,6 +608,106 @@
         </w:rPr>
       </w:pPr>
       <w:r>
+        <w:t xml:space="preserve"> </w:t>
+      </w:r>
+      <w:r>
+        <w:rPr>
+          <w:b/>
+          <w:bCs/>
+        </w:rPr>
+        <w:t>E. Interactive Social Engagement (Likes &amp; Comments)</w:t>
+      </w:r>
+    </w:p>
+    <w:p>
+      <w:pPr>
+        <w:pStyle w:val="ListParagraph"/>
+        <w:numPr>
+          <w:ilvl w:val="0"/>
+          <w:numId w:val="14"/>
+        </w:numPr>
+      </w:pPr>
+      <w:r>
+        <w:rPr>
+          <w:b/>
+          <w:bCs/>
+        </w:rPr>
+        <w:lastRenderedPageBreak/>
+        <w:t>Database Constraints:</w:t>
+      </w:r>
+      <w:r>
+        <w:t xml:space="preserve"> Enforced a composite unique constraint @@</w:t>
+      </w:r>
+      <w:proofErr w:type="gramStart"/>
+      <w:r>
+        <w:t>unique(</w:t>
+      </w:r>
+      <w:proofErr w:type="gramEnd"/>
+      <w:r>
+        <w:t xml:space="preserve">[userId, </w:t>
+      </w:r>
+      <w:proofErr w:type="spellStart"/>
+      <w:r>
+        <w:t>blogId</w:t>
+      </w:r>
+      <w:proofErr w:type="spellEnd"/>
+      <w:r>
+        <w:t>]) on the Like model to strictly guarantee at the database level that a user can only like a post once.</w:t>
+      </w:r>
+    </w:p>
+    <w:p>
+      <w:pPr>
+        <w:pStyle w:val="ListParagraph"/>
+        <w:numPr>
+          <w:ilvl w:val="0"/>
+          <w:numId w:val="14"/>
+        </w:numPr>
+      </w:pPr>
+      <w:r>
+        <w:rPr>
+          <w:b/>
+          <w:bCs/>
+        </w:rPr>
+        <w:t>Real-Time UX:</w:t>
+      </w:r>
+      <w:r>
+        <w:t xml:space="preserve"> Engineered the frontend BlogCard and </w:t>
+      </w:r>
+      <w:proofErr w:type="spellStart"/>
+      <w:r>
+        <w:t>SingleBlogPage</w:t>
+      </w:r>
+      <w:proofErr w:type="spellEnd"/>
+      <w:r>
+        <w:t xml:space="preserve"> components to instantly update like counts and render new comments upon a successful 200/201 HTTP status code, delivering a "real-time" feel without requiring heavy window reloads.</w:t>
+      </w:r>
+    </w:p>
+    <w:p>
+      <w:pPr>
+        <w:pStyle w:val="ListParagraph"/>
+        <w:numPr>
+          <w:ilvl w:val="0"/>
+          <w:numId w:val="14"/>
+        </w:numPr>
+      </w:pPr>
+      <w:r>
+        <w:rPr>
+          <w:b/>
+          <w:bCs/>
+        </w:rPr>
+        <w:t>Relational Queries:</w:t>
+      </w:r>
+      <w:r>
+        <w:t xml:space="preserve"> Utilized Prisma's nested include directives to fetch comments and their associated author emails in a single, optimized database trip, returning them sorted by newest first.</w:t>
+      </w:r>
+    </w:p>
+    <w:p>
+      <w:pPr>
+        <w:rPr>
+          <w:b/>
+          <w:bCs/>
+        </w:rPr>
+      </w:pPr>
+      <w:r>
         <w:rPr>
           <w:b/>
           <w:bCs/>
@@ -617,7 +717,6 @@
     </w:p>
     <w:p>
       <w:r>
-        <w:lastRenderedPageBreak/>
         <w:t xml:space="preserve">To exceed standard assessment requirements, three enterprise-grade features were integrated directly into the </w:t>
       </w:r>
       <w:proofErr w:type="spellStart"/>
@@ -876,6 +975,7 @@
         </w:numPr>
       </w:pPr>
       <w:r>
+        <w:lastRenderedPageBreak/>
         <w:t>Centralized both frontend and backend directories within a single, public GitHub repository.</w:t>
       </w:r>
     </w:p>
@@ -1026,7 +1126,6 @@
           <w:b/>
           <w:bCs/>
         </w:rPr>
-        <w:lastRenderedPageBreak/>
         <w:t>Database Synchronization Strategy:</w:t>
       </w:r>
       <w:r>
@@ -1308,6 +1407,7 @@
           <w:i/>
           <w:iCs/>
         </w:rPr>
+        <w:lastRenderedPageBreak/>
         <w:t>Resolution:</w:t>
       </w:r>
       <w:r>
@@ -1440,7 +1540,6 @@
           <w:i/>
           <w:iCs/>
         </w:rPr>
-        <w:lastRenderedPageBreak/>
         <w:t>Issue:</w:t>
       </w:r>
       <w:r>
@@ -1747,7 +1846,11 @@
         <w:t>Trade-off:</w:t>
       </w:r>
       <w:r>
-        <w:t xml:space="preserve"> This allowed for rapid decoupling of the frontend and backend without complex CORS credential configurations. In a strict enterprise production iteration, migrating the token to a secure, </w:t>
+        <w:t xml:space="preserve"> This allowed for rapid decoupling of the frontend and backend without complex CORS credential configurations. In a strict enterprise </w:t>
+      </w:r>
+      <w:r>
+        <w:lastRenderedPageBreak/>
+        <w:t xml:space="preserve">production iteration, migrating the token to a secure, </w:t>
       </w:r>
       <w:proofErr w:type="spellStart"/>
       <w:r>
@@ -1817,11 +1920,7 @@
         </w:numPr>
       </w:pPr>
       <w:r>
-        <w:t xml:space="preserve">The GET /blogs/public/feed endpoint would be deeply cached in the Redis layer. Because the public feed is functionally identical for all </w:t>
-      </w:r>
-      <w:r>
-        <w:lastRenderedPageBreak/>
-        <w:t>unauthenticated users, serving the JSON payload directly from memory prevents thousands of redundant database queries per second.</w:t>
+        <w:t>The GET /blogs/public/feed endpoint would be deeply cached in the Redis layer. Because the public feed is functionally identical for all unauthenticated users, serving the JSON payload directly from memory prevents thousands of redundant database queries per second.</w:t>
       </w:r>
     </w:p>
     <w:p>
@@ -1937,7 +2036,7 @@
     <w:p>
       <w:r>
         <w:pict w14:anchorId="710A2E8B">
-          <v:rect id="_x0000_i1099" style="width:0;height:1.5pt" o:hralign="center" o:hrstd="t" o:hrnoshade="t" o:hr="t" fillcolor="gray" stroked="f"/>
+          <v:rect id="_x0000_i1025" style="width:0;height:1.5pt" o:hralign="center" o:hrstd="t" o:hrnoshade="t" o:hr="t" fillcolor="gray" stroked="f"/>
         </w:pict>
       </w:r>
     </w:p>
@@ -3421,6 +3520,119 @@
     </w:lvl>
   </w:abstractNum>
   <w:abstractNum w:abstractNumId="10" w15:restartNumberingAfterBreak="0">
+    <w:nsid w:val="5EF5366C"/>
+    <w:multiLevelType w:val="hybridMultilevel"/>
+    <w:tmpl w:val="23107A7E"/>
+    <w:lvl w:ilvl="0" w:tplc="40090001">
+      <w:start w:val="1"/>
+      <w:numFmt w:val="bullet"/>
+      <w:lvlText w:val=""/>
+      <w:lvlJc w:val="left"/>
+      <w:pPr>
+        <w:ind w:left="720" w:hanging="360"/>
+      </w:pPr>
+      <w:rPr>
+        <w:rFonts w:ascii="Symbol" w:hAnsi="Symbol" w:hint="default"/>
+      </w:rPr>
+    </w:lvl>
+    <w:lvl w:ilvl="1" w:tplc="40090003" w:tentative="1">
+      <w:start w:val="1"/>
+      <w:numFmt w:val="bullet"/>
+      <w:lvlText w:val="o"/>
+      <w:lvlJc w:val="left"/>
+      <w:pPr>
+        <w:ind w:left="1440" w:hanging="360"/>
+      </w:pPr>
+      <w:rPr>
+        <w:rFonts w:ascii="Courier New" w:hAnsi="Courier New" w:cs="Courier New" w:hint="default"/>
+      </w:rPr>
+    </w:lvl>
+    <w:lvl w:ilvl="2" w:tplc="40090005" w:tentative="1">
+      <w:start w:val="1"/>
+      <w:numFmt w:val="bullet"/>
+      <w:lvlText w:val=""/>
+      <w:lvlJc w:val="left"/>
+      <w:pPr>
+        <w:ind w:left="2160" w:hanging="360"/>
+      </w:pPr>
+      <w:rPr>
+        <w:rFonts w:ascii="Wingdings" w:hAnsi="Wingdings" w:hint="default"/>
+      </w:rPr>
+    </w:lvl>
+    <w:lvl w:ilvl="3" w:tplc="40090001" w:tentative="1">
+      <w:start w:val="1"/>
+      <w:numFmt w:val="bullet"/>
+      <w:lvlText w:val=""/>
+      <w:lvlJc w:val="left"/>
+      <w:pPr>
+        <w:ind w:left="2880" w:hanging="360"/>
+      </w:pPr>
+      <w:rPr>
+        <w:rFonts w:ascii="Symbol" w:hAnsi="Symbol" w:hint="default"/>
+      </w:rPr>
+    </w:lvl>
+    <w:lvl w:ilvl="4" w:tplc="40090003" w:tentative="1">
+      <w:start w:val="1"/>
+      <w:numFmt w:val="bullet"/>
+      <w:lvlText w:val="o"/>
+      <w:lvlJc w:val="left"/>
+      <w:pPr>
+        <w:ind w:left="3600" w:hanging="360"/>
+      </w:pPr>
+      <w:rPr>
+        <w:rFonts w:ascii="Courier New" w:hAnsi="Courier New" w:cs="Courier New" w:hint="default"/>
+      </w:rPr>
+    </w:lvl>
+    <w:lvl w:ilvl="5" w:tplc="40090005" w:tentative="1">
+      <w:start w:val="1"/>
+      <w:numFmt w:val="bullet"/>
+      <w:lvlText w:val=""/>
+      <w:lvlJc w:val="left"/>
+      <w:pPr>
+        <w:ind w:left="4320" w:hanging="360"/>
+      </w:pPr>
+      <w:rPr>
+        <w:rFonts w:ascii="Wingdings" w:hAnsi="Wingdings" w:hint="default"/>
+      </w:rPr>
+    </w:lvl>
+    <w:lvl w:ilvl="6" w:tplc="40090001" w:tentative="1">
+      <w:start w:val="1"/>
+      <w:numFmt w:val="bullet"/>
+      <w:lvlText w:val=""/>
+      <w:lvlJc w:val="left"/>
+      <w:pPr>
+        <w:ind w:left="5040" w:hanging="360"/>
+      </w:pPr>
+      <w:rPr>
+        <w:rFonts w:ascii="Symbol" w:hAnsi="Symbol" w:hint="default"/>
+      </w:rPr>
+    </w:lvl>
+    <w:lvl w:ilvl="7" w:tplc="40090003" w:tentative="1">
+      <w:start w:val="1"/>
+      <w:numFmt w:val="bullet"/>
+      <w:lvlText w:val="o"/>
+      <w:lvlJc w:val="left"/>
+      <w:pPr>
+        <w:ind w:left="5760" w:hanging="360"/>
+      </w:pPr>
+      <w:rPr>
+        <w:rFonts w:ascii="Courier New" w:hAnsi="Courier New" w:cs="Courier New" w:hint="default"/>
+      </w:rPr>
+    </w:lvl>
+    <w:lvl w:ilvl="8" w:tplc="40090005" w:tentative="1">
+      <w:start w:val="1"/>
+      <w:numFmt w:val="bullet"/>
+      <w:lvlText w:val=""/>
+      <w:lvlJc w:val="left"/>
+      <w:pPr>
+        <w:ind w:left="6480" w:hanging="360"/>
+      </w:pPr>
+      <w:rPr>
+        <w:rFonts w:ascii="Wingdings" w:hAnsi="Wingdings" w:hint="default"/>
+      </w:rPr>
+    </w:lvl>
+  </w:abstractNum>
+  <w:abstractNum w:abstractNumId="11" w15:restartNumberingAfterBreak="0">
     <w:nsid w:val="66424CFE"/>
     <w:multiLevelType w:val="multilevel"/>
     <w:tmpl w:val="EC6A6102"/>
@@ -3569,7 +3781,7 @@
       </w:rPr>
     </w:lvl>
   </w:abstractNum>
-  <w:abstractNum w:abstractNumId="11" w15:restartNumberingAfterBreak="0">
+  <w:abstractNum w:abstractNumId="12" w15:restartNumberingAfterBreak="0">
     <w:nsid w:val="6DA517C1"/>
     <w:multiLevelType w:val="multilevel"/>
     <w:tmpl w:val="DF02CAA2"/>
@@ -3686,7 +3898,7 @@
       </w:pPr>
     </w:lvl>
   </w:abstractNum>
-  <w:abstractNum w:abstractNumId="12" w15:restartNumberingAfterBreak="0">
+  <w:abstractNum w:abstractNumId="13" w15:restartNumberingAfterBreak="0">
     <w:nsid w:val="72D93A6D"/>
     <w:multiLevelType w:val="multilevel"/>
     <w:tmpl w:val="60F06BE2"/>
@@ -3807,7 +4019,7 @@
     <w:abstractNumId w:val="1"/>
   </w:num>
   <w:num w:numId="2" w16cid:durableId="223419455">
-    <w:abstractNumId w:val="10"/>
+    <w:abstractNumId w:val="11"/>
   </w:num>
   <w:num w:numId="3" w16cid:durableId="942735673">
     <w:abstractNumId w:val="6"/>
@@ -3822,7 +4034,7 @@
     <w:abstractNumId w:val="2"/>
   </w:num>
   <w:num w:numId="7" w16cid:durableId="574703628">
-    <w:abstractNumId w:val="12"/>
+    <w:abstractNumId w:val="13"/>
   </w:num>
   <w:num w:numId="8" w16cid:durableId="1491018168">
     <w:abstractNumId w:val="5"/>
@@ -3840,7 +4052,10 @@
     <w:abstractNumId w:val="8"/>
   </w:num>
   <w:num w:numId="13" w16cid:durableId="875317546">
-    <w:abstractNumId w:val="11"/>
+    <w:abstractNumId w:val="12"/>
+  </w:num>
+  <w:num w:numId="14" w16cid:durableId="1753117679">
+    <w:abstractNumId w:val="10"/>
   </w:num>
 </w:numbering>
 </file>
@@ -4448,6 +4663,7 @@
   <w:style w:type="character" w:default="1" w:styleId="DefaultParagraphFont">
     <w:name w:val="Default Paragraph Font"/>
     <w:uiPriority w:val="1"/>
+    <w:semiHidden/>
     <w:unhideWhenUsed/>
   </w:style>
   <w:style w:type="table" w:default="1" w:styleId="TableNormal">

</xml_diff>